<commit_message>
Anadir analisis de Brandwatch y social listening (canal pasivo)
- PROVIDERS.md: nueva seccion "Social listening" con comparativa de
  Brandwatch ($800/mes+), Talkwalker, Meltwater (enterprise),
  Brand24 ($99/mes), Buska, Mention (SMB), y opcion DIY
  (X API + Reddit + Claude) para presupuesto bajo.

- docx: nueva subseccion 5.7 con tabla comparativa, deep dive de
  Iris AI (Ask Iris, AI Dashboards, Query Writer, Conversation Insights),
  casos de uso en sector publico, recomendacion por escenario de
  presupuesto, y nota arquitectonica clave: listening + contactacion
  son complementarios (listening descubre temas, encuestas miden
  prevalencia en muestra controlada).

- Fuentes: links a Brandwatch home, Iris AI, guia de sector publico,
  comparativas y pricing en Vendr.
</commit_message>
<xml_diff>
--- a/docs/SEVERO_TRONADOR_Research.docx
+++ b/docs/SEVERO_TRONADOR_Research.docx
@@ -7619,6 +7619,1555 @@
     </w:p>
     <w:p>
       <w:pPr>
+        <w:pStyle w:val="Heading2"/>
+        <w:spacing w:after="160" w:before="280"/>
+      </w:pPr>
+      <w:r>
+        <w:rPr>
+          <w:b/>
+          <w:bCs/>
+        </w:rPr>
+        <w:t xml:space="preserve">5.7 Social listening — Brandwatch y alternativas (canal pasivo)</w:t>
+      </w:r>
+    </w:p>
+    <w:tbl>
+      <w:tblPr>
+        <w:tblW w:type="dxa" w:w="9360"/>
+        <w:tblBorders>
+          <w:top w:val="single" w:color="auto" w:sz="4"/>
+          <w:left w:val="single" w:color="auto" w:sz="4"/>
+          <w:bottom w:val="single" w:color="auto" w:sz="4"/>
+          <w:right w:val="single" w:color="auto" w:sz="4"/>
+          <w:insideH w:val="single" w:color="auto" w:sz="4"/>
+          <w:insideV w:val="single" w:color="auto" w:sz="4"/>
+        </w:tblBorders>
+      </w:tblPr>
+      <w:tblGrid>
+        <w:gridCol w:w="9360"/>
+      </w:tblGrid>
+      <w:tr>
+        <w:tc>
+          <w:tcPr>
+            <w:tcW w:type="dxa" w:w="9360"/>
+            <w:tcBorders>
+              <w:top w:val="single" w:color="1F4E79" w:sz="4"/>
+              <w:left w:val="single" w:color="1F4E79" w:sz="24"/>
+              <w:bottom w:val="single" w:color="1F4E79" w:sz="4"/>
+              <w:right w:val="single" w:color="1F4E79" w:sz="4"/>
+            </w:tcBorders>
+            <w:shd w:fill="D5E8F0" w:val="clear"/>
+            <w:tcMar>
+              <w:top w:type="dxa" w:w="160"/>
+              <w:left w:type="dxa" w:w="200"/>
+              <w:bottom w:type="dxa" w:w="160"/>
+              <w:right w:type="dxa" w:w="200"/>
+            </w:tcMar>
+          </w:tcPr>
+          <w:p>
+            <w:r>
+              <w:rPr>
+                <w:i/>
+                <w:iCs/>
+              </w:rPr>
+              <w:t xml:space="preserve">Mientras los canales 5.1–5.6 son ACTIVOS (nosotros contactamos al ciudadano), social listening es PASIVO: monitoreamos qué dice la ciudadanía organicamente en X/Twitter, Reddit, TikTok, foros, podcasts y noticias. Útil para detectar temas emergentes ANTES de diseñar una encuesta, calibrar sentiment baseline, o disparar alertas en tiempo real.</w:t>
+            </w:r>
+          </w:p>
+        </w:tc>
+      </w:tr>
+    </w:tbl>
+    <w:p>
+      <w:pPr>
+        <w:pStyle w:val="Heading3"/>
+        <w:spacing w:after="120" w:before="220"/>
+      </w:pPr>
+      <w:r>
+        <w:rPr>
+          <w:b/>
+          <w:bCs/>
+        </w:rPr>
+        <w:t xml:space="preserve">Comparativa de plataformas</w:t>
+      </w:r>
+    </w:p>
+    <w:tbl>
+      <w:tblPr>
+        <w:tblW w:type="dxa" w:w="9360"/>
+        <w:tblBorders>
+          <w:top w:val="single" w:color="auto" w:sz="4"/>
+          <w:left w:val="single" w:color="auto" w:sz="4"/>
+          <w:bottom w:val="single" w:color="auto" w:sz="4"/>
+          <w:right w:val="single" w:color="auto" w:sz="4"/>
+          <w:insideH w:val="single" w:color="auto" w:sz="4"/>
+          <w:insideV w:val="single" w:color="auto" w:sz="4"/>
+        </w:tblBorders>
+      </w:tblPr>
+      <w:tblGrid>
+        <w:gridCol w:w="2100"/>
+        <w:gridCol w:w="2100"/>
+        <w:gridCol w:w="2900"/>
+        <w:gridCol w:w="2260"/>
+      </w:tblGrid>
+      <w:tr>
+        <w:trPr>
+          <w:tblHeader/>
+        </w:trPr>
+        <w:tc>
+          <w:tcPr>
+            <w:tcW w:type="dxa" w:w="2100"/>
+            <w:tcBorders>
+              <w:top w:val="single" w:color="BFBFBF" w:sz="4"/>
+              <w:left w:val="single" w:color="BFBFBF" w:sz="4"/>
+              <w:bottom w:val="single" w:color="BFBFBF" w:sz="4"/>
+              <w:right w:val="single" w:color="BFBFBF" w:sz="4"/>
+            </w:tcBorders>
+            <w:shd w:fill="1F4E79" w:val="clear"/>
+            <w:tcMar>
+              <w:top w:type="dxa" w:w="80"/>
+              <w:left w:type="dxa" w:w="120"/>
+              <w:bottom w:type="dxa" w:w="80"/>
+              <w:right w:type="dxa" w:w="120"/>
+            </w:tcMar>
+          </w:tcPr>
+          <w:p>
+            <w:r>
+              <w:rPr>
+                <w:b/>
+                <w:bCs/>
+                <w:color w:val="FFFFFF"/>
+                <w:sz w:val="20"/>
+                <w:szCs w:val="20"/>
+              </w:rPr>
+              <w:t xml:space="preserve">Plataforma</w:t>
+            </w:r>
+          </w:p>
+        </w:tc>
+        <w:tc>
+          <w:tcPr>
+            <w:tcW w:type="dxa" w:w="2100"/>
+            <w:tcBorders>
+              <w:top w:val="single" w:color="BFBFBF" w:sz="4"/>
+              <w:left w:val="single" w:color="BFBFBF" w:sz="4"/>
+              <w:bottom w:val="single" w:color="BFBFBF" w:sz="4"/>
+              <w:right w:val="single" w:color="BFBFBF" w:sz="4"/>
+            </w:tcBorders>
+            <w:shd w:fill="1F4E79" w:val="clear"/>
+            <w:tcMar>
+              <w:top w:type="dxa" w:w="80"/>
+              <w:left w:type="dxa" w:w="120"/>
+              <w:bottom w:type="dxa" w:w="80"/>
+              <w:right w:type="dxa" w:w="120"/>
+            </w:tcMar>
+          </w:tcPr>
+          <w:p>
+            <w:r>
+              <w:rPr>
+                <w:b/>
+                <w:bCs/>
+                <w:color w:val="FFFFFF"/>
+                <w:sz w:val="20"/>
+                <w:szCs w:val="20"/>
+              </w:rPr>
+              <w:t xml:space="preserve">Pricing 2026</w:t>
+            </w:r>
+          </w:p>
+        </w:tc>
+        <w:tc>
+          <w:tcPr>
+            <w:tcW w:type="dxa" w:w="2900"/>
+            <w:tcBorders>
+              <w:top w:val="single" w:color="BFBFBF" w:sz="4"/>
+              <w:left w:val="single" w:color="BFBFBF" w:sz="4"/>
+              <w:bottom w:val="single" w:color="BFBFBF" w:sz="4"/>
+              <w:right w:val="single" w:color="BFBFBF" w:sz="4"/>
+            </w:tcBorders>
+            <w:shd w:fill="1F4E79" w:val="clear"/>
+            <w:tcMar>
+              <w:top w:type="dxa" w:w="80"/>
+              <w:left w:type="dxa" w:w="120"/>
+              <w:bottom w:type="dxa" w:w="80"/>
+              <w:right w:type="dxa" w:w="120"/>
+            </w:tcMar>
+          </w:tcPr>
+          <w:p>
+            <w:r>
+              <w:rPr>
+                <w:b/>
+                <w:bCs/>
+                <w:color w:val="FFFFFF"/>
+                <w:sz w:val="20"/>
+                <w:szCs w:val="20"/>
+              </w:rPr>
+              <w:t xml:space="preserve">Fuentes</w:t>
+            </w:r>
+          </w:p>
+        </w:tc>
+        <w:tc>
+          <w:tcPr>
+            <w:tcW w:type="dxa" w:w="2260"/>
+            <w:tcBorders>
+              <w:top w:val="single" w:color="BFBFBF" w:sz="4"/>
+              <w:left w:val="single" w:color="BFBFBF" w:sz="4"/>
+              <w:bottom w:val="single" w:color="BFBFBF" w:sz="4"/>
+              <w:right w:val="single" w:color="BFBFBF" w:sz="4"/>
+            </w:tcBorders>
+            <w:shd w:fill="1F4E79" w:val="clear"/>
+            <w:tcMar>
+              <w:top w:type="dxa" w:w="80"/>
+              <w:left w:type="dxa" w:w="120"/>
+              <w:bottom w:type="dxa" w:w="80"/>
+              <w:right w:type="dxa" w:w="120"/>
+            </w:tcMar>
+          </w:tcPr>
+          <w:p>
+            <w:r>
+              <w:rPr>
+                <w:b/>
+                <w:bCs/>
+                <w:color w:val="FFFFFF"/>
+                <w:sz w:val="20"/>
+                <w:szCs w:val="20"/>
+              </w:rPr>
+              <w:t xml:space="preserve">Recomendación</w:t>
+            </w:r>
+          </w:p>
+        </w:tc>
+      </w:tr>
+      <w:tr>
+        <w:tc>
+          <w:tcPr>
+            <w:tcW w:type="dxa" w:w="2100"/>
+            <w:tcBorders>
+              <w:top w:val="single" w:color="BFBFBF" w:sz="4"/>
+              <w:left w:val="single" w:color="BFBFBF" w:sz="4"/>
+              <w:bottom w:val="single" w:color="BFBFBF" w:sz="4"/>
+              <w:right w:val="single" w:color="BFBFBF" w:sz="4"/>
+            </w:tcBorders>
+            <w:tcMar>
+              <w:top w:type="dxa" w:w="80"/>
+              <w:left w:type="dxa" w:w="120"/>
+              <w:bottom w:type="dxa" w:w="80"/>
+              <w:right w:type="dxa" w:w="120"/>
+            </w:tcMar>
+          </w:tcPr>
+          <w:p>
+            <w:r>
+              <w:rPr>
+                <w:b/>
+                <w:bCs/>
+                <w:sz w:val="20"/>
+                <w:szCs w:val="20"/>
+              </w:rPr>
+              <w:t xml:space="preserve">Brandwatch</w:t>
+            </w:r>
+          </w:p>
+        </w:tc>
+        <w:tc>
+          <w:tcPr>
+            <w:tcW w:type="dxa" w:w="2100"/>
+            <w:tcBorders>
+              <w:top w:val="single" w:color="BFBFBF" w:sz="4"/>
+              <w:left w:val="single" w:color="BFBFBF" w:sz="4"/>
+              <w:bottom w:val="single" w:color="BFBFBF" w:sz="4"/>
+              <w:right w:val="single" w:color="BFBFBF" w:sz="4"/>
+            </w:tcBorders>
+            <w:tcMar>
+              <w:top w:type="dxa" w:w="80"/>
+              <w:left w:type="dxa" w:w="120"/>
+              <w:bottom w:type="dxa" w:w="80"/>
+              <w:right w:type="dxa" w:w="120"/>
+            </w:tcMar>
+          </w:tcPr>
+          <w:p>
+            <w:r>
+              <w:rPr>
+                <w:sz w:val="20"/>
+                <w:szCs w:val="20"/>
+              </w:rPr>
+              <w:t xml:space="preserve">Desde $800/mes (anual); típico $25k+/año</w:t>
+            </w:r>
+          </w:p>
+        </w:tc>
+        <w:tc>
+          <w:tcPr>
+            <w:tcW w:type="dxa" w:w="2900"/>
+            <w:tcBorders>
+              <w:top w:val="single" w:color="BFBFBF" w:sz="4"/>
+              <w:left w:val="single" w:color="BFBFBF" w:sz="4"/>
+              <w:bottom w:val="single" w:color="BFBFBF" w:sz="4"/>
+              <w:right w:val="single" w:color="BFBFBF" w:sz="4"/>
+            </w:tcBorders>
+            <w:tcMar>
+              <w:top w:type="dxa" w:w="80"/>
+              <w:left w:type="dxa" w:w="120"/>
+              <w:bottom w:type="dxa" w:w="80"/>
+              <w:right w:type="dxa" w:w="120"/>
+            </w:tcMar>
+          </w:tcPr>
+          <w:p>
+            <w:r>
+              <w:rPr>
+                <w:sz w:val="20"/>
+                <w:szCs w:val="20"/>
+              </w:rPr>
+              <w:t xml:space="preserve">100M+ (X, Reddit, TikTok, 70k podcasts, foros, news, blogs)</w:t>
+            </w:r>
+          </w:p>
+        </w:tc>
+        <w:tc>
+          <w:tcPr>
+            <w:tcW w:type="dxa" w:w="2260"/>
+            <w:tcBorders>
+              <w:top w:val="single" w:color="BFBFBF" w:sz="4"/>
+              <w:left w:val="single" w:color="BFBFBF" w:sz="4"/>
+              <w:bottom w:val="single" w:color="BFBFBF" w:sz="4"/>
+              <w:right w:val="single" w:color="BFBFBF" w:sz="4"/>
+            </w:tcBorders>
+            <w:tcMar>
+              <w:top w:type="dxa" w:w="80"/>
+              <w:left w:type="dxa" w:w="120"/>
+              <w:bottom w:type="dxa" w:w="80"/>
+              <w:right w:type="dxa" w:w="120"/>
+            </w:tcMar>
+          </w:tcPr>
+          <w:p>
+            <w:r>
+              <w:rPr>
+                <w:sz w:val="20"/>
+                <w:szCs w:val="20"/>
+              </w:rPr>
+              <w:t xml:space="preserve">Enterprise — sobrado para municipio salvo presupuesto alto</w:t>
+            </w:r>
+          </w:p>
+        </w:tc>
+      </w:tr>
+      <w:tr>
+        <w:tc>
+          <w:tcPr>
+            <w:tcW w:type="dxa" w:w="2100"/>
+            <w:tcBorders>
+              <w:top w:val="single" w:color="BFBFBF" w:sz="4"/>
+              <w:left w:val="single" w:color="BFBFBF" w:sz="4"/>
+              <w:bottom w:val="single" w:color="BFBFBF" w:sz="4"/>
+              <w:right w:val="single" w:color="BFBFBF" w:sz="4"/>
+            </w:tcBorders>
+            <w:shd w:fill="F2F2F2" w:val="clear"/>
+            <w:tcMar>
+              <w:top w:type="dxa" w:w="80"/>
+              <w:left w:type="dxa" w:w="120"/>
+              <w:bottom w:type="dxa" w:w="80"/>
+              <w:right w:type="dxa" w:w="120"/>
+            </w:tcMar>
+          </w:tcPr>
+          <w:p>
+            <w:r>
+              <w:rPr>
+                <w:sz w:val="20"/>
+                <w:szCs w:val="20"/>
+              </w:rPr>
+              <w:t xml:space="preserve">Talkwalker (Hootsuite)</w:t>
+            </w:r>
+          </w:p>
+        </w:tc>
+        <w:tc>
+          <w:tcPr>
+            <w:tcW w:type="dxa" w:w="2100"/>
+            <w:tcBorders>
+              <w:top w:val="single" w:color="BFBFBF" w:sz="4"/>
+              <w:left w:val="single" w:color="BFBFBF" w:sz="4"/>
+              <w:bottom w:val="single" w:color="BFBFBF" w:sz="4"/>
+              <w:right w:val="single" w:color="BFBFBF" w:sz="4"/>
+            </w:tcBorders>
+            <w:shd w:fill="F2F2F2" w:val="clear"/>
+            <w:tcMar>
+              <w:top w:type="dxa" w:w="80"/>
+              <w:left w:type="dxa" w:w="120"/>
+              <w:bottom w:type="dxa" w:w="80"/>
+              <w:right w:type="dxa" w:w="120"/>
+            </w:tcMar>
+          </w:tcPr>
+          <w:p>
+            <w:r>
+              <w:rPr>
+                <w:sz w:val="20"/>
+                <w:szCs w:val="20"/>
+              </w:rPr>
+              <w:t xml:space="preserve">~$9.6k/año entry; $27k+/año típico</w:t>
+            </w:r>
+          </w:p>
+        </w:tc>
+        <w:tc>
+          <w:tcPr>
+            <w:tcW w:type="dxa" w:w="2900"/>
+            <w:tcBorders>
+              <w:top w:val="single" w:color="BFBFBF" w:sz="4"/>
+              <w:left w:val="single" w:color="BFBFBF" w:sz="4"/>
+              <w:bottom w:val="single" w:color="BFBFBF" w:sz="4"/>
+              <w:right w:val="single" w:color="BFBFBF" w:sz="4"/>
+            </w:tcBorders>
+            <w:shd w:fill="F2F2F2" w:val="clear"/>
+            <w:tcMar>
+              <w:top w:type="dxa" w:w="80"/>
+              <w:left w:type="dxa" w:w="120"/>
+              <w:bottom w:type="dxa" w:w="80"/>
+              <w:right w:type="dxa" w:w="120"/>
+            </w:tcMar>
+          </w:tcPr>
+          <w:p>
+            <w:r>
+              <w:rPr>
+                <w:sz w:val="20"/>
+                <w:szCs w:val="20"/>
+              </w:rPr>
+              <w:t xml:space="preserve">Global + visual AI (image recognition)</w:t>
+            </w:r>
+          </w:p>
+        </w:tc>
+        <w:tc>
+          <w:tcPr>
+            <w:tcW w:type="dxa" w:w="2260"/>
+            <w:tcBorders>
+              <w:top w:val="single" w:color="BFBFBF" w:sz="4"/>
+              <w:left w:val="single" w:color="BFBFBF" w:sz="4"/>
+              <w:bottom w:val="single" w:color="BFBFBF" w:sz="4"/>
+              <w:right w:val="single" w:color="BFBFBF" w:sz="4"/>
+            </w:tcBorders>
+            <w:shd w:fill="F2F2F2" w:val="clear"/>
+            <w:tcMar>
+              <w:top w:type="dxa" w:w="80"/>
+              <w:left w:type="dxa" w:w="120"/>
+              <w:bottom w:type="dxa" w:w="80"/>
+              <w:right w:type="dxa" w:w="120"/>
+            </w:tcMar>
+          </w:tcPr>
+          <w:p>
+            <w:r>
+              <w:rPr>
+                <w:sz w:val="20"/>
+                <w:szCs w:val="20"/>
+              </w:rPr>
+              <w:t xml:space="preserve">Similar a BW, fuerte en visual y multi-idioma</w:t>
+            </w:r>
+          </w:p>
+        </w:tc>
+      </w:tr>
+      <w:tr>
+        <w:tc>
+          <w:tcPr>
+            <w:tcW w:type="dxa" w:w="2100"/>
+            <w:tcBorders>
+              <w:top w:val="single" w:color="BFBFBF" w:sz="4"/>
+              <w:left w:val="single" w:color="BFBFBF" w:sz="4"/>
+              <w:bottom w:val="single" w:color="BFBFBF" w:sz="4"/>
+              <w:right w:val="single" w:color="BFBFBF" w:sz="4"/>
+            </w:tcBorders>
+            <w:tcMar>
+              <w:top w:type="dxa" w:w="80"/>
+              <w:left w:type="dxa" w:w="120"/>
+              <w:bottom w:type="dxa" w:w="80"/>
+              <w:right w:type="dxa" w:w="120"/>
+            </w:tcMar>
+          </w:tcPr>
+          <w:p>
+            <w:r>
+              <w:rPr>
+                <w:sz w:val="20"/>
+                <w:szCs w:val="20"/>
+              </w:rPr>
+              <w:t xml:space="preserve">Meltwater</w:t>
+            </w:r>
+          </w:p>
+        </w:tc>
+        <w:tc>
+          <w:tcPr>
+            <w:tcW w:type="dxa" w:w="2100"/>
+            <w:tcBorders>
+              <w:top w:val="single" w:color="BFBFBF" w:sz="4"/>
+              <w:left w:val="single" w:color="BFBFBF" w:sz="4"/>
+              <w:bottom w:val="single" w:color="BFBFBF" w:sz="4"/>
+              <w:right w:val="single" w:color="BFBFBF" w:sz="4"/>
+            </w:tcBorders>
+            <w:tcMar>
+              <w:top w:type="dxa" w:w="80"/>
+              <w:left w:type="dxa" w:w="120"/>
+              <w:bottom w:type="dxa" w:w="80"/>
+              <w:right w:type="dxa" w:w="120"/>
+            </w:tcMar>
+          </w:tcPr>
+          <w:p>
+            <w:r>
+              <w:rPr>
+                <w:sz w:val="20"/>
+                <w:szCs w:val="20"/>
+              </w:rPr>
+              <w:t xml:space="preserve">~$25k/año mediano</w:t>
+            </w:r>
+          </w:p>
+        </w:tc>
+        <w:tc>
+          <w:tcPr>
+            <w:tcW w:type="dxa" w:w="2900"/>
+            <w:tcBorders>
+              <w:top w:val="single" w:color="BFBFBF" w:sz="4"/>
+              <w:left w:val="single" w:color="BFBFBF" w:sz="4"/>
+              <w:bottom w:val="single" w:color="BFBFBF" w:sz="4"/>
+              <w:right w:val="single" w:color="BFBFBF" w:sz="4"/>
+            </w:tcBorders>
+            <w:tcMar>
+              <w:top w:type="dxa" w:w="80"/>
+              <w:left w:type="dxa" w:w="120"/>
+              <w:bottom w:type="dxa" w:w="80"/>
+              <w:right w:type="dxa" w:w="120"/>
+            </w:tcMar>
+          </w:tcPr>
+          <w:p>
+            <w:r>
+              <w:rPr>
+                <w:sz w:val="20"/>
+                <w:szCs w:val="20"/>
+              </w:rPr>
+              <w:t xml:space="preserve">PR + medios + social + Klear influencers</w:t>
+            </w:r>
+          </w:p>
+        </w:tc>
+        <w:tc>
+          <w:tcPr>
+            <w:tcW w:type="dxa" w:w="2260"/>
+            <w:tcBorders>
+              <w:top w:val="single" w:color="BFBFBF" w:sz="4"/>
+              <w:left w:val="single" w:color="BFBFBF" w:sz="4"/>
+              <w:bottom w:val="single" w:color="BFBFBF" w:sz="4"/>
+              <w:right w:val="single" w:color="BFBFBF" w:sz="4"/>
+            </w:tcBorders>
+            <w:tcMar>
+              <w:top w:type="dxa" w:w="80"/>
+              <w:left w:type="dxa" w:w="120"/>
+              <w:bottom w:type="dxa" w:w="80"/>
+              <w:right w:type="dxa" w:w="120"/>
+            </w:tcMar>
+          </w:tcPr>
+          <w:p>
+            <w:r>
+              <w:rPr>
+                <w:sz w:val="20"/>
+                <w:szCs w:val="20"/>
+              </w:rPr>
+              <w:t xml:space="preserve">Mejor para PR/medios tradicionales</w:t>
+            </w:r>
+          </w:p>
+        </w:tc>
+      </w:tr>
+      <w:tr>
+        <w:tc>
+          <w:tcPr>
+            <w:tcW w:type="dxa" w:w="2100"/>
+            <w:tcBorders>
+              <w:top w:val="single" w:color="BFBFBF" w:sz="4"/>
+              <w:left w:val="single" w:color="BFBFBF" w:sz="4"/>
+              <w:bottom w:val="single" w:color="BFBFBF" w:sz="4"/>
+              <w:right w:val="single" w:color="BFBFBF" w:sz="4"/>
+            </w:tcBorders>
+            <w:shd w:fill="F2F2F2" w:val="clear"/>
+            <w:tcMar>
+              <w:top w:type="dxa" w:w="80"/>
+              <w:left w:type="dxa" w:w="120"/>
+              <w:bottom w:type="dxa" w:w="80"/>
+              <w:right w:type="dxa" w:w="120"/>
+            </w:tcMar>
+          </w:tcPr>
+          <w:p>
+            <w:r>
+              <w:rPr>
+                <w:b/>
+                <w:bCs/>
+                <w:sz w:val="20"/>
+                <w:szCs w:val="20"/>
+              </w:rPr>
+              <w:t xml:space="preserve">Brand24 ⭐</w:t>
+            </w:r>
+          </w:p>
+        </w:tc>
+        <w:tc>
+          <w:tcPr>
+            <w:tcW w:type="dxa" w:w="2100"/>
+            <w:tcBorders>
+              <w:top w:val="single" w:color="BFBFBF" w:sz="4"/>
+              <w:left w:val="single" w:color="BFBFBF" w:sz="4"/>
+              <w:bottom w:val="single" w:color="BFBFBF" w:sz="4"/>
+              <w:right w:val="single" w:color="BFBFBF" w:sz="4"/>
+            </w:tcBorders>
+            <w:shd w:fill="F2F2F2" w:val="clear"/>
+            <w:tcMar>
+              <w:top w:type="dxa" w:w="80"/>
+              <w:left w:type="dxa" w:w="120"/>
+              <w:bottom w:type="dxa" w:w="80"/>
+              <w:right w:type="dxa" w:w="120"/>
+            </w:tcMar>
+          </w:tcPr>
+          <w:p>
+            <w:r>
+              <w:rPr>
+                <w:sz w:val="20"/>
+                <w:szCs w:val="20"/>
+              </w:rPr>
+              <w:t xml:space="preserve">$99–$199/mes</w:t>
+            </w:r>
+          </w:p>
+        </w:tc>
+        <w:tc>
+          <w:tcPr>
+            <w:tcW w:type="dxa" w:w="2900"/>
+            <w:tcBorders>
+              <w:top w:val="single" w:color="BFBFBF" w:sz="4"/>
+              <w:left w:val="single" w:color="BFBFBF" w:sz="4"/>
+              <w:bottom w:val="single" w:color="BFBFBF" w:sz="4"/>
+              <w:right w:val="single" w:color="BFBFBF" w:sz="4"/>
+            </w:tcBorders>
+            <w:shd w:fill="F2F2F2" w:val="clear"/>
+            <w:tcMar>
+              <w:top w:type="dxa" w:w="80"/>
+              <w:left w:type="dxa" w:w="120"/>
+              <w:bottom w:type="dxa" w:w="80"/>
+              <w:right w:type="dxa" w:w="120"/>
+            </w:tcMar>
+          </w:tcPr>
+          <w:p>
+            <w:r>
+              <w:rPr>
+                <w:sz w:val="20"/>
+                <w:szCs w:val="20"/>
+              </w:rPr>
+              <w:t xml:space="preserve">X, Reddit, TikTok, IG, FB, web, blogs</w:t>
+            </w:r>
+          </w:p>
+        </w:tc>
+        <w:tc>
+          <w:tcPr>
+            <w:tcW w:type="dxa" w:w="2260"/>
+            <w:tcBorders>
+              <w:top w:val="single" w:color="BFBFBF" w:sz="4"/>
+              <w:left w:val="single" w:color="BFBFBF" w:sz="4"/>
+              <w:bottom w:val="single" w:color="BFBFBF" w:sz="4"/>
+              <w:right w:val="single" w:color="BFBFBF" w:sz="4"/>
+            </w:tcBorders>
+            <w:shd w:fill="F2F2F2" w:val="clear"/>
+            <w:tcMar>
+              <w:top w:type="dxa" w:w="80"/>
+              <w:left w:type="dxa" w:w="120"/>
+              <w:bottom w:type="dxa" w:w="80"/>
+              <w:right w:type="dxa" w:w="120"/>
+            </w:tcMar>
+          </w:tcPr>
+          <w:p>
+            <w:r>
+              <w:rPr>
+                <w:sz w:val="20"/>
+                <w:szCs w:val="20"/>
+              </w:rPr>
+              <w:t xml:space="preserve">Mejor relación costo/feature para municipio</w:t>
+            </w:r>
+          </w:p>
+        </w:tc>
+      </w:tr>
+      <w:tr>
+        <w:tc>
+          <w:tcPr>
+            <w:tcW w:type="dxa" w:w="2100"/>
+            <w:tcBorders>
+              <w:top w:val="single" w:color="BFBFBF" w:sz="4"/>
+              <w:left w:val="single" w:color="BFBFBF" w:sz="4"/>
+              <w:bottom w:val="single" w:color="BFBFBF" w:sz="4"/>
+              <w:right w:val="single" w:color="BFBFBF" w:sz="4"/>
+            </w:tcBorders>
+            <w:tcMar>
+              <w:top w:type="dxa" w:w="80"/>
+              <w:left w:type="dxa" w:w="120"/>
+              <w:bottom w:type="dxa" w:w="80"/>
+              <w:right w:type="dxa" w:w="120"/>
+            </w:tcMar>
+          </w:tcPr>
+          <w:p>
+            <w:r>
+              <w:rPr>
+                <w:sz w:val="20"/>
+                <w:szCs w:val="20"/>
+              </w:rPr>
+              <w:t xml:space="preserve">Buska</w:t>
+            </w:r>
+          </w:p>
+        </w:tc>
+        <w:tc>
+          <w:tcPr>
+            <w:tcW w:type="dxa" w:w="2100"/>
+            <w:tcBorders>
+              <w:top w:val="single" w:color="BFBFBF" w:sz="4"/>
+              <w:left w:val="single" w:color="BFBFBF" w:sz="4"/>
+              <w:bottom w:val="single" w:color="BFBFBF" w:sz="4"/>
+              <w:right w:val="single" w:color="BFBFBF" w:sz="4"/>
+            </w:tcBorders>
+            <w:tcMar>
+              <w:top w:type="dxa" w:w="80"/>
+              <w:left w:type="dxa" w:w="120"/>
+              <w:bottom w:type="dxa" w:w="80"/>
+              <w:right w:type="dxa" w:w="120"/>
+            </w:tcMar>
+          </w:tcPr>
+          <w:p>
+            <w:r>
+              <w:rPr>
+                <w:sz w:val="20"/>
+                <w:szCs w:val="20"/>
+              </w:rPr>
+              <w:t xml:space="preserve">$49/mes</w:t>
+            </w:r>
+          </w:p>
+        </w:tc>
+        <w:tc>
+          <w:tcPr>
+            <w:tcW w:type="dxa" w:w="2900"/>
+            <w:tcBorders>
+              <w:top w:val="single" w:color="BFBFBF" w:sz="4"/>
+              <w:left w:val="single" w:color="BFBFBF" w:sz="4"/>
+              <w:bottom w:val="single" w:color="BFBFBF" w:sz="4"/>
+              <w:right w:val="single" w:color="BFBFBF" w:sz="4"/>
+            </w:tcBorders>
+            <w:tcMar>
+              <w:top w:type="dxa" w:w="80"/>
+              <w:left w:type="dxa" w:w="120"/>
+              <w:bottom w:type="dxa" w:w="80"/>
+              <w:right w:type="dxa" w:w="120"/>
+            </w:tcMar>
+          </w:tcPr>
+          <w:p>
+            <w:r>
+              <w:rPr>
+                <w:sz w:val="20"/>
+                <w:szCs w:val="20"/>
+              </w:rPr>
+              <w:t xml:space="preserve">30+ plataformas</w:t>
+            </w:r>
+          </w:p>
+        </w:tc>
+        <w:tc>
+          <w:tcPr>
+            <w:tcW w:type="dxa" w:w="2260"/>
+            <w:tcBorders>
+              <w:top w:val="single" w:color="BFBFBF" w:sz="4"/>
+              <w:left w:val="single" w:color="BFBFBF" w:sz="4"/>
+              <w:bottom w:val="single" w:color="BFBFBF" w:sz="4"/>
+              <w:right w:val="single" w:color="BFBFBF" w:sz="4"/>
+            </w:tcBorders>
+            <w:tcMar>
+              <w:top w:type="dxa" w:w="80"/>
+              <w:left w:type="dxa" w:w="120"/>
+              <w:bottom w:type="dxa" w:w="80"/>
+              <w:right w:type="dxa" w:w="120"/>
+            </w:tcMar>
+          </w:tcPr>
+          <w:p>
+            <w:r>
+              <w:rPr>
+                <w:sz w:val="20"/>
+                <w:szCs w:val="20"/>
+              </w:rPr>
+              <w:t xml:space="preserve">Alternativa barata SMB</w:t>
+            </w:r>
+          </w:p>
+        </w:tc>
+      </w:tr>
+      <w:tr>
+        <w:tc>
+          <w:tcPr>
+            <w:tcW w:type="dxa" w:w="2100"/>
+            <w:tcBorders>
+              <w:top w:val="single" w:color="BFBFBF" w:sz="4"/>
+              <w:left w:val="single" w:color="BFBFBF" w:sz="4"/>
+              <w:bottom w:val="single" w:color="BFBFBF" w:sz="4"/>
+              <w:right w:val="single" w:color="BFBFBF" w:sz="4"/>
+            </w:tcBorders>
+            <w:shd w:fill="F2F2F2" w:val="clear"/>
+            <w:tcMar>
+              <w:top w:type="dxa" w:w="80"/>
+              <w:left w:type="dxa" w:w="120"/>
+              <w:bottom w:type="dxa" w:w="80"/>
+              <w:right w:type="dxa" w:w="120"/>
+            </w:tcMar>
+          </w:tcPr>
+          <w:p>
+            <w:r>
+              <w:rPr>
+                <w:sz w:val="20"/>
+                <w:szCs w:val="20"/>
+              </w:rPr>
+              <w:t xml:space="preserve">Mention</w:t>
+            </w:r>
+          </w:p>
+        </w:tc>
+        <w:tc>
+          <w:tcPr>
+            <w:tcW w:type="dxa" w:w="2100"/>
+            <w:tcBorders>
+              <w:top w:val="single" w:color="BFBFBF" w:sz="4"/>
+              <w:left w:val="single" w:color="BFBFBF" w:sz="4"/>
+              <w:bottom w:val="single" w:color="BFBFBF" w:sz="4"/>
+              <w:right w:val="single" w:color="BFBFBF" w:sz="4"/>
+            </w:tcBorders>
+            <w:shd w:fill="F2F2F2" w:val="clear"/>
+            <w:tcMar>
+              <w:top w:type="dxa" w:w="80"/>
+              <w:left w:type="dxa" w:w="120"/>
+              <w:bottom w:type="dxa" w:w="80"/>
+              <w:right w:type="dxa" w:w="120"/>
+            </w:tcMar>
+          </w:tcPr>
+          <w:p>
+            <w:r>
+              <w:rPr>
+                <w:sz w:val="20"/>
+                <w:szCs w:val="20"/>
+              </w:rPr>
+              <w:t xml:space="preserve">$41/mes (free limitado)</w:t>
+            </w:r>
+          </w:p>
+        </w:tc>
+        <w:tc>
+          <w:tcPr>
+            <w:tcW w:type="dxa" w:w="2900"/>
+            <w:tcBorders>
+              <w:top w:val="single" w:color="BFBFBF" w:sz="4"/>
+              <w:left w:val="single" w:color="BFBFBF" w:sz="4"/>
+              <w:bottom w:val="single" w:color="BFBFBF" w:sz="4"/>
+              <w:right w:val="single" w:color="BFBFBF" w:sz="4"/>
+            </w:tcBorders>
+            <w:shd w:fill="F2F2F2" w:val="clear"/>
+            <w:tcMar>
+              <w:top w:type="dxa" w:w="80"/>
+              <w:left w:type="dxa" w:w="120"/>
+              <w:bottom w:type="dxa" w:w="80"/>
+              <w:right w:type="dxa" w:w="120"/>
+            </w:tcMar>
+          </w:tcPr>
+          <w:p>
+            <w:r>
+              <w:rPr>
+                <w:sz w:val="20"/>
+                <w:szCs w:val="20"/>
+              </w:rPr>
+              <w:t xml:space="preserve">Web + redes</w:t>
+            </w:r>
+          </w:p>
+        </w:tc>
+        <w:tc>
+          <w:tcPr>
+            <w:tcW w:type="dxa" w:w="2260"/>
+            <w:tcBorders>
+              <w:top w:val="single" w:color="BFBFBF" w:sz="4"/>
+              <w:left w:val="single" w:color="BFBFBF" w:sz="4"/>
+              <w:bottom w:val="single" w:color="BFBFBF" w:sz="4"/>
+              <w:right w:val="single" w:color="BFBFBF" w:sz="4"/>
+            </w:tcBorders>
+            <w:shd w:fill="F2F2F2" w:val="clear"/>
+            <w:tcMar>
+              <w:top w:type="dxa" w:w="80"/>
+              <w:left w:type="dxa" w:w="120"/>
+              <w:bottom w:type="dxa" w:w="80"/>
+              <w:right w:type="dxa" w:w="120"/>
+            </w:tcMar>
+          </w:tcPr>
+          <w:p>
+            <w:r>
+              <w:rPr>
+                <w:sz w:val="20"/>
+                <w:szCs w:val="20"/>
+              </w:rPr>
+              <w:t xml:space="preserve">Alternativa SMB</w:t>
+            </w:r>
+          </w:p>
+        </w:tc>
+      </w:tr>
+      <w:tr>
+        <w:tc>
+          <w:tcPr>
+            <w:tcW w:type="dxa" w:w="2100"/>
+            <w:tcBorders>
+              <w:top w:val="single" w:color="BFBFBF" w:sz="4"/>
+              <w:left w:val="single" w:color="BFBFBF" w:sz="4"/>
+              <w:bottom w:val="single" w:color="BFBFBF" w:sz="4"/>
+              <w:right w:val="single" w:color="BFBFBF" w:sz="4"/>
+            </w:tcBorders>
+            <w:tcMar>
+              <w:top w:type="dxa" w:w="80"/>
+              <w:left w:type="dxa" w:w="120"/>
+              <w:bottom w:type="dxa" w:w="80"/>
+              <w:right w:type="dxa" w:w="120"/>
+            </w:tcMar>
+          </w:tcPr>
+          <w:p>
+            <w:r>
+              <w:rPr>
+                <w:b/>
+                <w:bCs/>
+                <w:sz w:val="20"/>
+                <w:szCs w:val="20"/>
+              </w:rPr>
+              <w:t xml:space="preserve">DIY (X+Reddit+Claude)</w:t>
+            </w:r>
+          </w:p>
+        </w:tc>
+        <w:tc>
+          <w:tcPr>
+            <w:tcW w:type="dxa" w:w="2100"/>
+            <w:tcBorders>
+              <w:top w:val="single" w:color="BFBFBF" w:sz="4"/>
+              <w:left w:val="single" w:color="BFBFBF" w:sz="4"/>
+              <w:bottom w:val="single" w:color="BFBFBF" w:sz="4"/>
+              <w:right w:val="single" w:color="BFBFBF" w:sz="4"/>
+            </w:tcBorders>
+            <w:tcMar>
+              <w:top w:type="dxa" w:w="80"/>
+              <w:left w:type="dxa" w:w="120"/>
+              <w:bottom w:type="dxa" w:w="80"/>
+              <w:right w:type="dxa" w:w="120"/>
+            </w:tcMar>
+          </w:tcPr>
+          <w:p>
+            <w:r>
+              <w:rPr>
+                <w:sz w:val="20"/>
+                <w:szCs w:val="20"/>
+              </w:rPr>
+              <w:t xml:space="preserve">$0–$200/mes</w:t>
+            </w:r>
+          </w:p>
+        </w:tc>
+        <w:tc>
+          <w:tcPr>
+            <w:tcW w:type="dxa" w:w="2900"/>
+            <w:tcBorders>
+              <w:top w:val="single" w:color="BFBFBF" w:sz="4"/>
+              <w:left w:val="single" w:color="BFBFBF" w:sz="4"/>
+              <w:bottom w:val="single" w:color="BFBFBF" w:sz="4"/>
+              <w:right w:val="single" w:color="BFBFBF" w:sz="4"/>
+            </w:tcBorders>
+            <w:tcMar>
+              <w:top w:type="dxa" w:w="80"/>
+              <w:left w:type="dxa" w:w="120"/>
+              <w:bottom w:type="dxa" w:w="80"/>
+              <w:right w:type="dxa" w:w="120"/>
+            </w:tcMar>
+          </w:tcPr>
+          <w:p>
+            <w:r>
+              <w:rPr>
+                <w:sz w:val="20"/>
+                <w:szCs w:val="20"/>
+              </w:rPr>
+              <w:t xml:space="preserve">Lo que integremos manualmente</w:t>
+            </w:r>
+          </w:p>
+        </w:tc>
+        <w:tc>
+          <w:tcPr>
+            <w:tcW w:type="dxa" w:w="2260"/>
+            <w:tcBorders>
+              <w:top w:val="single" w:color="BFBFBF" w:sz="4"/>
+              <w:left w:val="single" w:color="BFBFBF" w:sz="4"/>
+              <w:bottom w:val="single" w:color="BFBFBF" w:sz="4"/>
+              <w:right w:val="single" w:color="BFBFBF" w:sz="4"/>
+            </w:tcBorders>
+            <w:tcMar>
+              <w:top w:type="dxa" w:w="80"/>
+              <w:left w:type="dxa" w:w="120"/>
+              <w:bottom w:type="dxa" w:w="80"/>
+              <w:right w:type="dxa" w:w="120"/>
+            </w:tcMar>
+          </w:tcPr>
+          <w:p>
+            <w:r>
+              <w:rPr>
+                <w:sz w:val="20"/>
+                <w:szCs w:val="20"/>
+              </w:rPr>
+              <w:t xml:space="preserve">Si tenemos dev time, ~80% del valor a 1% del costo</w:t>
+            </w:r>
+          </w:p>
+        </w:tc>
+      </w:tr>
+      <w:tr>
+        <w:tc>
+          <w:tcPr>
+            <w:tcW w:type="dxa" w:w="2100"/>
+            <w:tcBorders>
+              <w:top w:val="single" w:color="BFBFBF" w:sz="4"/>
+              <w:left w:val="single" w:color="BFBFBF" w:sz="4"/>
+              <w:bottom w:val="single" w:color="BFBFBF" w:sz="4"/>
+              <w:right w:val="single" w:color="BFBFBF" w:sz="4"/>
+            </w:tcBorders>
+            <w:shd w:fill="F2F2F2" w:val="clear"/>
+            <w:tcMar>
+              <w:top w:type="dxa" w:w="80"/>
+              <w:left w:type="dxa" w:w="120"/>
+              <w:bottom w:type="dxa" w:w="80"/>
+              <w:right w:type="dxa" w:w="120"/>
+            </w:tcMar>
+          </w:tcPr>
+          <w:p>
+            <w:r>
+              <w:rPr>
+                <w:sz w:val="20"/>
+                <w:szCs w:val="20"/>
+              </w:rPr>
+              <w:t xml:space="preserve">Google Alerts</w:t>
+            </w:r>
+          </w:p>
+        </w:tc>
+        <w:tc>
+          <w:tcPr>
+            <w:tcW w:type="dxa" w:w="2100"/>
+            <w:tcBorders>
+              <w:top w:val="single" w:color="BFBFBF" w:sz="4"/>
+              <w:left w:val="single" w:color="BFBFBF" w:sz="4"/>
+              <w:bottom w:val="single" w:color="BFBFBF" w:sz="4"/>
+              <w:right w:val="single" w:color="BFBFBF" w:sz="4"/>
+            </w:tcBorders>
+            <w:shd w:fill="F2F2F2" w:val="clear"/>
+            <w:tcMar>
+              <w:top w:type="dxa" w:w="80"/>
+              <w:left w:type="dxa" w:w="120"/>
+              <w:bottom w:type="dxa" w:w="80"/>
+              <w:right w:type="dxa" w:w="120"/>
+            </w:tcMar>
+          </w:tcPr>
+          <w:p>
+            <w:r>
+              <w:rPr>
+                <w:sz w:val="20"/>
+                <w:szCs w:val="20"/>
+              </w:rPr>
+              <w:t xml:space="preserve">Gratis</w:t>
+            </w:r>
+          </w:p>
+        </w:tc>
+        <w:tc>
+          <w:tcPr>
+            <w:tcW w:type="dxa" w:w="2900"/>
+            <w:tcBorders>
+              <w:top w:val="single" w:color="BFBFBF" w:sz="4"/>
+              <w:left w:val="single" w:color="BFBFBF" w:sz="4"/>
+              <w:bottom w:val="single" w:color="BFBFBF" w:sz="4"/>
+              <w:right w:val="single" w:color="BFBFBF" w:sz="4"/>
+            </w:tcBorders>
+            <w:shd w:fill="F2F2F2" w:val="clear"/>
+            <w:tcMar>
+              <w:top w:type="dxa" w:w="80"/>
+              <w:left w:type="dxa" w:w="120"/>
+              <w:bottom w:type="dxa" w:w="80"/>
+              <w:right w:type="dxa" w:w="120"/>
+            </w:tcMar>
+          </w:tcPr>
+          <w:p>
+            <w:r>
+              <w:rPr>
+                <w:sz w:val="20"/>
+                <w:szCs w:val="20"/>
+              </w:rPr>
+              <w:t xml:space="preserve">Web</w:t>
+            </w:r>
+          </w:p>
+        </w:tc>
+        <w:tc>
+          <w:tcPr>
+            <w:tcW w:type="dxa" w:w="2260"/>
+            <w:tcBorders>
+              <w:top w:val="single" w:color="BFBFBF" w:sz="4"/>
+              <w:left w:val="single" w:color="BFBFBF" w:sz="4"/>
+              <w:bottom w:val="single" w:color="BFBFBF" w:sz="4"/>
+              <w:right w:val="single" w:color="BFBFBF" w:sz="4"/>
+            </w:tcBorders>
+            <w:shd w:fill="F2F2F2" w:val="clear"/>
+            <w:tcMar>
+              <w:top w:type="dxa" w:w="80"/>
+              <w:left w:type="dxa" w:w="120"/>
+              <w:bottom w:type="dxa" w:w="80"/>
+              <w:right w:type="dxa" w:w="120"/>
+            </w:tcMar>
+          </w:tcPr>
+          <w:p>
+            <w:r>
+              <w:rPr>
+                <w:sz w:val="20"/>
+                <w:szCs w:val="20"/>
+              </w:rPr>
+              <w:t xml:space="preserve">Mínimo viable, sin real-time ni APIs</w:t>
+            </w:r>
+          </w:p>
+        </w:tc>
+      </w:tr>
+    </w:tbl>
+    <w:p>
+      <w:pPr>
+        <w:pStyle w:val="Heading3"/>
+        <w:spacing w:after="120" w:before="220"/>
+      </w:pPr>
+      <w:r>
+        <w:rPr>
+          <w:b/>
+          <w:bCs/>
+        </w:rPr>
+        <w:t xml:space="preserve">Iris AI — el feature destacado de Brandwatch en 2026</w:t>
+      </w:r>
+    </w:p>
+    <w:p>
+      <w:pPr>
+        <w:pStyle w:val="ListParagraph"/>
+        <w:numPr>
+          <w:ilvl w:val="0"/>
+          <w:numId w:val="2"/>
+        </w:numPr>
+        <w:spacing w:after="80"/>
+      </w:pPr>
+      <w:r>
+        <w:t xml:space="preserve">"Ask Iris": chat conversacional sobre el dataset — preguntas en lenguaje natural tipo "¿qué se dice de transporte público en Maipú en los últimos 30 días?" devuelve respuesta narrativa con citas.</w:t>
+      </w:r>
+    </w:p>
+    <w:p>
+      <w:pPr>
+        <w:pStyle w:val="ListParagraph"/>
+        <w:numPr>
+          <w:ilvl w:val="0"/>
+          <w:numId w:val="2"/>
+        </w:numPr>
+        <w:spacing w:after="80"/>
+      </w:pPr>
+      <w:r>
+        <w:t xml:space="preserve">AI Dashboards: genera resúmenes ejecutivos automáticos sobre cualquier query.</w:t>
+      </w:r>
+    </w:p>
+    <w:p>
+      <w:pPr>
+        <w:pStyle w:val="ListParagraph"/>
+        <w:numPr>
+          <w:ilvl w:val="0"/>
+          <w:numId w:val="2"/>
+        </w:numPr>
+        <w:spacing w:after="80"/>
+      </w:pPr>
+      <w:r>
+        <w:t xml:space="preserve">AI Query Writer: traduce prompts en lenguaje natural a queries Booleanas complejas (lenguaje técnico de social listening).</w:t>
+      </w:r>
+    </w:p>
+    <w:p>
+      <w:pPr>
+        <w:pStyle w:val="ListParagraph"/>
+        <w:numPr>
+          <w:ilvl w:val="0"/>
+          <w:numId w:val="2"/>
+        </w:numPr>
+        <w:spacing w:after="80"/>
+      </w:pPr>
+      <w:r>
+        <w:t xml:space="preserve">Conversation Insights: agrupa miles de menciones en clusters temáticos digeribles.</w:t>
+      </w:r>
+    </w:p>
+    <w:p>
+      <w:pPr>
+        <w:pStyle w:val="ListParagraph"/>
+        <w:numPr>
+          <w:ilvl w:val="0"/>
+          <w:numId w:val="2"/>
+        </w:numPr>
+        <w:spacing w:after="80"/>
+      </w:pPr>
+      <w:r>
+        <w:t xml:space="preserve">Roadmap 2026 (anunciado): análisis de video/imagen, "Bring Your Own Data" para cargar nuestros propios datasets junto al de Brandwatch, expansión APAC y app mobile nativa.</w:t>
+      </w:r>
+    </w:p>
+    <w:p>
+      <w:pPr>
+        <w:pStyle w:val="Heading3"/>
+        <w:spacing w:after="120" w:before="220"/>
+      </w:pPr>
+      <w:r>
+        <w:rPr>
+          <w:b/>
+          <w:bCs/>
+        </w:rPr>
+        <w:t xml:space="preserve">Casos de uso documentados en sector público</w:t>
+      </w:r>
+    </w:p>
+    <w:p>
+      <w:pPr>
+        <w:spacing w:after="120"/>
+      </w:pPr>
+      <w:r>
+        <w:t xml:space="preserve">Brandwatch publica guías específicas para gobiernos: detectar shifts en prioridades ciudadanas, gestionar crisis comms en tiempo real, validar mensajes oficiales antes y después del lanzamiento, detectar misinformation que requiera respuesta institucional, y monitorear sentiment sobre proyectos de obra pública. En UK tienen procurement pathway pre-aprobado para entes públicos, lo que sugiere madurez en esta vertical.</w:t>
+      </w:r>
+    </w:p>
+    <w:p>
+      <w:pPr>
+        <w:pStyle w:val="Heading3"/>
+        <w:spacing w:after="120" w:before="220"/>
+      </w:pPr>
+      <w:r>
+        <w:rPr>
+          <w:b/>
+          <w:bCs/>
+        </w:rPr>
+        <w:t xml:space="preserve">Decisión para Severo Tronador</w:t>
+      </w:r>
+    </w:p>
+    <w:tbl>
+      <w:tblPr>
+        <w:tblW w:type="dxa" w:w="9360"/>
+        <w:tblBorders>
+          <w:top w:val="single" w:color="auto" w:sz="4"/>
+          <w:left w:val="single" w:color="auto" w:sz="4"/>
+          <w:bottom w:val="single" w:color="auto" w:sz="4"/>
+          <w:right w:val="single" w:color="auto" w:sz="4"/>
+          <w:insideH w:val="single" w:color="auto" w:sz="4"/>
+          <w:insideV w:val="single" w:color="auto" w:sz="4"/>
+        </w:tblBorders>
+      </w:tblPr>
+      <w:tblGrid>
+        <w:gridCol w:w="3400"/>
+        <w:gridCol w:w="5960"/>
+      </w:tblGrid>
+      <w:tr>
+        <w:trPr>
+          <w:tblHeader/>
+        </w:trPr>
+        <w:tc>
+          <w:tcPr>
+            <w:tcW w:type="dxa" w:w="3400"/>
+            <w:tcBorders>
+              <w:top w:val="single" w:color="BFBFBF" w:sz="4"/>
+              <w:left w:val="single" w:color="BFBFBF" w:sz="4"/>
+              <w:bottom w:val="single" w:color="BFBFBF" w:sz="4"/>
+              <w:right w:val="single" w:color="BFBFBF" w:sz="4"/>
+            </w:tcBorders>
+            <w:shd w:fill="1F4E79" w:val="clear"/>
+            <w:tcMar>
+              <w:top w:type="dxa" w:w="80"/>
+              <w:left w:type="dxa" w:w="120"/>
+              <w:bottom w:type="dxa" w:w="80"/>
+              <w:right w:type="dxa" w:w="120"/>
+            </w:tcMar>
+          </w:tcPr>
+          <w:p>
+            <w:r>
+              <w:rPr>
+                <w:b/>
+                <w:bCs/>
+                <w:color w:val="FFFFFF"/>
+                <w:sz w:val="20"/>
+                <w:szCs w:val="20"/>
+              </w:rPr>
+              <w:t xml:space="preserve">Escenario</w:t>
+            </w:r>
+          </w:p>
+        </w:tc>
+        <w:tc>
+          <w:tcPr>
+            <w:tcW w:type="dxa" w:w="5960"/>
+            <w:tcBorders>
+              <w:top w:val="single" w:color="BFBFBF" w:sz="4"/>
+              <w:left w:val="single" w:color="BFBFBF" w:sz="4"/>
+              <w:bottom w:val="single" w:color="BFBFBF" w:sz="4"/>
+              <w:right w:val="single" w:color="BFBFBF" w:sz="4"/>
+            </w:tcBorders>
+            <w:shd w:fill="1F4E79" w:val="clear"/>
+            <w:tcMar>
+              <w:top w:type="dxa" w:w="80"/>
+              <w:left w:type="dxa" w:w="120"/>
+              <w:bottom w:type="dxa" w:w="80"/>
+              <w:right w:type="dxa" w:w="120"/>
+            </w:tcMar>
+          </w:tcPr>
+          <w:p>
+            <w:r>
+              <w:rPr>
+                <w:b/>
+                <w:bCs/>
+                <w:color w:val="FFFFFF"/>
+                <w:sz w:val="20"/>
+                <w:szCs w:val="20"/>
+              </w:rPr>
+              <w:t xml:space="preserve">Recomendación</w:t>
+            </w:r>
+          </w:p>
+        </w:tc>
+      </w:tr>
+      <w:tr>
+        <w:tc>
+          <w:tcPr>
+            <w:tcW w:type="dxa" w:w="3400"/>
+            <w:tcBorders>
+              <w:top w:val="single" w:color="BFBFBF" w:sz="4"/>
+              <w:left w:val="single" w:color="BFBFBF" w:sz="4"/>
+              <w:bottom w:val="single" w:color="BFBFBF" w:sz="4"/>
+              <w:right w:val="single" w:color="BFBFBF" w:sz="4"/>
+            </w:tcBorders>
+            <w:tcMar>
+              <w:top w:type="dxa" w:w="80"/>
+              <w:left w:type="dxa" w:w="120"/>
+              <w:bottom w:type="dxa" w:w="80"/>
+              <w:right w:type="dxa" w:w="120"/>
+            </w:tcMar>
+          </w:tcPr>
+          <w:p>
+            <w:r>
+              <w:rPr>
+                <w:sz w:val="20"/>
+                <w:szCs w:val="20"/>
+              </w:rPr>
+              <w:t xml:space="preserve">Fases F1–F6</w:t>
+            </w:r>
+          </w:p>
+        </w:tc>
+        <w:tc>
+          <w:tcPr>
+            <w:tcW w:type="dxa" w:w="5960"/>
+            <w:tcBorders>
+              <w:top w:val="single" w:color="BFBFBF" w:sz="4"/>
+              <w:left w:val="single" w:color="BFBFBF" w:sz="4"/>
+              <w:bottom w:val="single" w:color="BFBFBF" w:sz="4"/>
+              <w:right w:val="single" w:color="BFBFBF" w:sz="4"/>
+            </w:tcBorders>
+            <w:tcMar>
+              <w:top w:type="dxa" w:w="80"/>
+              <w:left w:type="dxa" w:w="120"/>
+              <w:bottom w:type="dxa" w:w="80"/>
+              <w:right w:type="dxa" w:w="120"/>
+            </w:tcMar>
+          </w:tcPr>
+          <w:p>
+            <w:r>
+              <w:rPr>
+                <w:sz w:val="20"/>
+                <w:szCs w:val="20"/>
+              </w:rPr>
+              <w:t xml:space="preserve">Omitir social listening — foco en contactación activa primero</w:t>
+            </w:r>
+          </w:p>
+        </w:tc>
+      </w:tr>
+      <w:tr>
+        <w:tc>
+          <w:tcPr>
+            <w:tcW w:type="dxa" w:w="3400"/>
+            <w:tcBorders>
+              <w:top w:val="single" w:color="BFBFBF" w:sz="4"/>
+              <w:left w:val="single" w:color="BFBFBF" w:sz="4"/>
+              <w:bottom w:val="single" w:color="BFBFBF" w:sz="4"/>
+              <w:right w:val="single" w:color="BFBFBF" w:sz="4"/>
+            </w:tcBorders>
+            <w:shd w:fill="F2F2F2" w:val="clear"/>
+            <w:tcMar>
+              <w:top w:type="dxa" w:w="80"/>
+              <w:left w:type="dxa" w:w="120"/>
+              <w:bottom w:type="dxa" w:w="80"/>
+              <w:right w:type="dxa" w:w="120"/>
+            </w:tcMar>
+          </w:tcPr>
+          <w:p>
+            <w:r>
+              <w:rPr>
+                <w:sz w:val="20"/>
+                <w:szCs w:val="20"/>
+              </w:rPr>
+              <w:t xml:space="preserve">F7+ con presupuesto bajo (~$0–$200/mes)</w:t>
+            </w:r>
+          </w:p>
+        </w:tc>
+        <w:tc>
+          <w:tcPr>
+            <w:tcW w:type="dxa" w:w="5960"/>
+            <w:tcBorders>
+              <w:top w:val="single" w:color="BFBFBF" w:sz="4"/>
+              <w:left w:val="single" w:color="BFBFBF" w:sz="4"/>
+              <w:bottom w:val="single" w:color="BFBFBF" w:sz="4"/>
+              <w:right w:val="single" w:color="BFBFBF" w:sz="4"/>
+            </w:tcBorders>
+            <w:shd w:fill="F2F2F2" w:val="clear"/>
+            <w:tcMar>
+              <w:top w:type="dxa" w:w="80"/>
+              <w:left w:type="dxa" w:w="120"/>
+              <w:bottom w:type="dxa" w:w="80"/>
+              <w:right w:type="dxa" w:w="120"/>
+            </w:tcMar>
+          </w:tcPr>
+          <w:p>
+            <w:r>
+              <w:rPr>
+                <w:sz w:val="20"/>
+                <w:szCs w:val="20"/>
+              </w:rPr>
+              <w:t xml:space="preserve">DIY: X API Basic (free) + Reddit API (free) + Claude API para sentiment ≈ 80% del valor por &lt;$50/mes. Requiere ~2 semanas de dev.</w:t>
+            </w:r>
+          </w:p>
+        </w:tc>
+      </w:tr>
+      <w:tr>
+        <w:tc>
+          <w:tcPr>
+            <w:tcW w:type="dxa" w:w="3400"/>
+            <w:tcBorders>
+              <w:top w:val="single" w:color="BFBFBF" w:sz="4"/>
+              <w:left w:val="single" w:color="BFBFBF" w:sz="4"/>
+              <w:bottom w:val="single" w:color="BFBFBF" w:sz="4"/>
+              <w:right w:val="single" w:color="BFBFBF" w:sz="4"/>
+            </w:tcBorders>
+            <w:tcMar>
+              <w:top w:type="dxa" w:w="80"/>
+              <w:left w:type="dxa" w:w="120"/>
+              <w:bottom w:type="dxa" w:w="80"/>
+              <w:right w:type="dxa" w:w="120"/>
+            </w:tcMar>
+          </w:tcPr>
+          <w:p>
+            <w:r>
+              <w:rPr>
+                <w:sz w:val="20"/>
+                <w:szCs w:val="20"/>
+              </w:rPr>
+              <w:t xml:space="preserve">F7+ con presupuesto medio (~$1.2k/año)</w:t>
+            </w:r>
+          </w:p>
+        </w:tc>
+        <w:tc>
+          <w:tcPr>
+            <w:tcW w:type="dxa" w:w="5960"/>
+            <w:tcBorders>
+              <w:top w:val="single" w:color="BFBFBF" w:sz="4"/>
+              <w:left w:val="single" w:color="BFBFBF" w:sz="4"/>
+              <w:bottom w:val="single" w:color="BFBFBF" w:sz="4"/>
+              <w:right w:val="single" w:color="BFBFBF" w:sz="4"/>
+            </w:tcBorders>
+            <w:tcMar>
+              <w:top w:type="dxa" w:w="80"/>
+              <w:left w:type="dxa" w:w="120"/>
+              <w:bottom w:type="dxa" w:w="80"/>
+              <w:right w:type="dxa" w:w="120"/>
+            </w:tcMar>
+          </w:tcPr>
+          <w:p>
+            <w:r>
+              <w:rPr>
+                <w:sz w:val="20"/>
+                <w:szCs w:val="20"/>
+              </w:rPr>
+              <w:t xml:space="preserve">Brand24 — cobertura buena, IA decente, asequible y rápido de adoptar.</w:t>
+            </w:r>
+          </w:p>
+        </w:tc>
+      </w:tr>
+      <w:tr>
+        <w:tc>
+          <w:tcPr>
+            <w:tcW w:type="dxa" w:w="3400"/>
+            <w:tcBorders>
+              <w:top w:val="single" w:color="BFBFBF" w:sz="4"/>
+              <w:left w:val="single" w:color="BFBFBF" w:sz="4"/>
+              <w:bottom w:val="single" w:color="BFBFBF" w:sz="4"/>
+              <w:right w:val="single" w:color="BFBFBF" w:sz="4"/>
+            </w:tcBorders>
+            <w:shd w:fill="F2F2F2" w:val="clear"/>
+            <w:tcMar>
+              <w:top w:type="dxa" w:w="80"/>
+              <w:left w:type="dxa" w:w="120"/>
+              <w:bottom w:type="dxa" w:w="80"/>
+              <w:right w:type="dxa" w:w="120"/>
+            </w:tcMar>
+          </w:tcPr>
+          <w:p>
+            <w:r>
+              <w:rPr>
+                <w:sz w:val="20"/>
+                <w:szCs w:val="20"/>
+              </w:rPr>
+              <w:t xml:space="preserve">F7+ con presupuesto alto (~$25k+/año)</w:t>
+            </w:r>
+          </w:p>
+        </w:tc>
+        <w:tc>
+          <w:tcPr>
+            <w:tcW w:type="dxa" w:w="5960"/>
+            <w:tcBorders>
+              <w:top w:val="single" w:color="BFBFBF" w:sz="4"/>
+              <w:left w:val="single" w:color="BFBFBF" w:sz="4"/>
+              <w:bottom w:val="single" w:color="BFBFBF" w:sz="4"/>
+              <w:right w:val="single" w:color="BFBFBF" w:sz="4"/>
+            </w:tcBorders>
+            <w:shd w:fill="F2F2F2" w:val="clear"/>
+            <w:tcMar>
+              <w:top w:type="dxa" w:w="80"/>
+              <w:left w:type="dxa" w:w="120"/>
+              <w:bottom w:type="dxa" w:w="80"/>
+              <w:right w:type="dxa" w:w="120"/>
+            </w:tcMar>
+          </w:tcPr>
+          <w:p>
+            <w:r>
+              <w:rPr>
+                <w:sz w:val="20"/>
+                <w:szCs w:val="20"/>
+              </w:rPr>
+              <w:t xml:space="preserve">Brandwatch — si necesitamos profundidad de podcasts/foros, reportes institucionales, o el storytelling de Iris AI para presentar a stakeholders.</w:t>
+            </w:r>
+          </w:p>
+        </w:tc>
+      </w:tr>
+    </w:tbl>
+    <w:tbl>
+      <w:tblPr>
+        <w:tblW w:type="dxa" w:w="9360"/>
+        <w:tblBorders>
+          <w:top w:val="single" w:color="auto" w:sz="4"/>
+          <w:left w:val="single" w:color="auto" w:sz="4"/>
+          <w:bottom w:val="single" w:color="auto" w:sz="4"/>
+          <w:right w:val="single" w:color="auto" w:sz="4"/>
+          <w:insideH w:val="single" w:color="auto" w:sz="4"/>
+          <w:insideV w:val="single" w:color="auto" w:sz="4"/>
+        </w:tblBorders>
+      </w:tblPr>
+      <w:tblGrid>
+        <w:gridCol w:w="9360"/>
+      </w:tblGrid>
+      <w:tr>
+        <w:tc>
+          <w:tcPr>
+            <w:tcW w:type="dxa" w:w="9360"/>
+            <w:tcBorders>
+              <w:top w:val="single" w:color="1F4E79" w:sz="4"/>
+              <w:left w:val="single" w:color="1F4E79" w:sz="24"/>
+              <w:bottom w:val="single" w:color="1F4E79" w:sz="4"/>
+              <w:right w:val="single" w:color="1F4E79" w:sz="4"/>
+            </w:tcBorders>
+            <w:shd w:fill="D5E8F0" w:val="clear"/>
+            <w:tcMar>
+              <w:top w:type="dxa" w:w="160"/>
+              <w:left w:type="dxa" w:w="200"/>
+              <w:bottom w:type="dxa" w:w="160"/>
+              <w:right w:type="dxa" w:w="200"/>
+            </w:tcMar>
+          </w:tcPr>
+          <w:p>
+            <w:r>
+              <w:rPr>
+                <w:i/>
+                <w:iCs/>
+              </w:rPr>
+              <w:t xml:space="preserve">Insight de arquitectura: Brandwatch (o cualquier social listening) y Severo Tronador son COMPLEMENTARIOS, no sustitutos. Brandwatch detecta DE QUÉ está hablando la gente; Severo Tronador pregunta directo a una muestra controlada del padrón. La pipeline ideal: usar listening para DESCUBRIR temas, después usar encuestas para MEDIR prevalencia en la población objetivo. Cierre del loop: las respuestas a encuestas pueden, a su vez, alimentar nuevas queries de listening ("¿qué tan generalizada está esta queja sobre el barrio X?").</w:t>
+            </w:r>
+          </w:p>
+        </w:tc>
+      </w:tr>
+    </w:tbl>
+    <w:p>
+      <w:r>
+        <w:br w:type="page"/>
+      </w:r>
+    </w:p>
+    <w:p>
+      <w:pPr>
         <w:pStyle w:val="Heading1"/>
         <w:spacing w:after="200" w:before="360"/>
       </w:pPr>
@@ -15848,7 +17397,7 @@
       <w:r>
         <w:t xml:space="preserve">· WhatsApp Business Messaging Policy — </w:t>
       </w:r>
-      <w:hyperlink w:history="1" r:id="rIdrktio6tc58v1djwh96u_c">
+      <w:hyperlink w:history="1" r:id="rIdd84zk4k9gpuf7wmccu1rw">
         <w:r>
           <w:rPr>
             <w:rStyle w:val="Hyperlink"/>
@@ -15864,7 +17413,7 @@
       <w:r>
         <w:t xml:space="preserve">· WhatsApp Cloud API &amp; Government Bodies (360dialog docs) — </w:t>
       </w:r>
-      <w:hyperlink w:history="1" r:id="rId4wnquhsqm_cgoee9b9tyh">
+      <w:hyperlink w:history="1" r:id="rIda5ruhxtjbfvqrxdphmmtg">
         <w:r>
           <w:rPr>
             <w:rStyle w:val="Hyperlink"/>
@@ -15880,7 +17429,7 @@
       <w:r>
         <w:t xml:space="preserve">· Resend Acceptable Use Policy — </w:t>
       </w:r>
-      <w:hyperlink w:history="1" r:id="rIdqfp-tiod01udm7eurpevg">
+      <w:hyperlink w:history="1" r:id="rIdau6eoeqtbvut58yropn7y">
         <w:r>
           <w:rPr>
             <w:rStyle w:val="Hyperlink"/>
@@ -15896,7 +17445,7 @@
       <w:r>
         <w:t xml:space="preserve">· Brevo Anti-spam Policy — </w:t>
       </w:r>
-      <w:hyperlink w:history="1" r:id="rIdppjqt6pt4hcq8-qpj__1h">
+      <w:hyperlink w:history="1" r:id="rIdoapeasmzhd_pj_5ji0o4f">
         <w:r>
           <w:rPr>
             <w:rStyle w:val="Hyperlink"/>
@@ -15925,7 +17474,7 @@
       <w:r>
         <w:t xml:space="preserve">· Email API pricing 2026 (Resend/SendGrid/Postmark) — </w:t>
       </w:r>
-      <w:hyperlink w:history="1" r:id="rIdxticeyjtfcvlacvegyynz">
+      <w:hyperlink w:history="1" r:id="rIdlcrwdqfugwpm8wwetvxbi">
         <w:r>
           <w:rPr>
             <w:rStyle w:val="Hyperlink"/>
@@ -15941,7 +17490,7 @@
       <w:r>
         <w:t xml:space="preserve">· WhatsApp API pricing 2026 — </w:t>
       </w:r>
-      <w:hyperlink w:history="1" r:id="rIdjdyxxux77qy9u-rzmgtva">
+      <w:hyperlink w:history="1" r:id="rIdeuweoicgqmeph4t3_jire">
         <w:r>
           <w:rPr>
             <w:rStyle w:val="Hyperlink"/>
@@ -15957,7 +17506,7 @@
       <w:r>
         <w:t xml:space="preserve">· Twilio vs 360dialog comparison — </w:t>
       </w:r>
-      <w:hyperlink w:history="1" r:id="rIdo642asbcffq1o5qya4fib">
+      <w:hyperlink w:history="1" r:id="rId4jactwqd-udcdr_d8hm2p">
         <w:r>
           <w:rPr>
             <w:rStyle w:val="Hyperlink"/>
@@ -15973,7 +17522,7 @@
       <w:r>
         <w:t xml:space="preserve">· SMS API comparison Twilio/Plivo/Vonage — </w:t>
       </w:r>
-      <w:hyperlink w:history="1" r:id="rIddyonal1ovfkwztz8pszjr">
+      <w:hyperlink w:history="1" r:id="rIdudhspxn4dni3dj0987uoa">
         <w:r>
           <w:rPr>
             <w:rStyle w:val="Hyperlink"/>
@@ -15989,7 +17538,7 @@
       <w:r>
         <w:t xml:space="preserve">· Argentina SMS pricing — </w:t>
       </w:r>
-      <w:hyperlink w:history="1" r:id="rIdi9oygelpjbsfalouxvydr">
+      <w:hyperlink w:history="1" r:id="rIduffhe1a9ywm-qk6ubc573">
         <w:r>
           <w:rPr>
             <w:rStyle w:val="Hyperlink"/>
@@ -16005,7 +17554,7 @@
       <w:r>
         <w:t xml:space="preserve">· 360nrs precios Argentina — </w:t>
       </w:r>
-      <w:hyperlink w:history="1" r:id="rIdrbx_x50h_lllxssqb9fuj">
+      <w:hyperlink w:history="1" r:id="rIdazsbplpck0q-toe-lo-3a">
         <w:r>
           <w:rPr>
             <w:rStyle w:val="Hyperlink"/>
@@ -16021,7 +17570,7 @@
       <w:r>
         <w:t xml:space="preserve">· Telnyx vs Twilio — </w:t>
       </w:r>
-      <w:hyperlink w:history="1" r:id="rIdtvsn0ywlgeoulrn-yt8kk">
+      <w:hyperlink w:history="1" r:id="rIdpgmacjurvibxmy9p5cpkq">
         <w:r>
           <w:rPr>
             <w:rStyle w:val="Hyperlink"/>
@@ -16037,7 +17586,7 @@
       <w:r>
         <w:t xml:space="preserve">· AI Voice Agents 2026 pricing — </w:t>
       </w:r>
-      <w:hyperlink w:history="1" r:id="rIdzrcmzmjianzz126hwfr1c">
+      <w:hyperlink w:history="1" r:id="rIdvmirqrtjwcrar71nxy2kf">
         <w:r>
           <w:rPr>
             <w:rStyle w:val="Hyperlink"/>
@@ -16056,6 +17605,99 @@
           <w:b/>
           <w:bCs/>
         </w:rPr>
+        <w:t xml:space="preserve">Social listening</w:t>
+      </w:r>
+    </w:p>
+    <w:p>
+      <w:pPr>
+        <w:spacing w:after="80"/>
+      </w:pPr>
+      <w:r>
+        <w:t xml:space="preserve">· Brandwatch (home) — </w:t>
+      </w:r>
+      <w:hyperlink w:history="1" r:id="rIdk5ovsvfhhse1yxp3aghd6">
+        <w:r>
+          <w:rPr>
+            <w:rStyle w:val="Hyperlink"/>
+          </w:rPr>
+          <w:t xml:space="preserve">brandwatch.com</w:t>
+        </w:r>
+      </w:hyperlink>
+    </w:p>
+    <w:p>
+      <w:pPr>
+        <w:spacing w:after="80"/>
+      </w:pPr>
+      <w:r>
+        <w:t xml:space="preserve">· Brandwatch Iris AI — </w:t>
+      </w:r>
+      <w:hyperlink w:history="1" r:id="rIdeh1u3lyj0dqyj_gj9flq3">
+        <w:r>
+          <w:rPr>
+            <w:rStyle w:val="Hyperlink"/>
+          </w:rPr>
+          <w:t xml:space="preserve">brandwatch.com/products/iris-ai</w:t>
+        </w:r>
+      </w:hyperlink>
+    </w:p>
+    <w:p>
+      <w:pPr>
+        <w:spacing w:after="80"/>
+      </w:pPr>
+      <w:r>
+        <w:t xml:space="preserve">· Brandwatch — Social listening for government (guía) — </w:t>
+      </w:r>
+      <w:hyperlink w:history="1" r:id="rIdn3gj7tbklr-nrdpjzeyyb">
+        <w:r>
+          <w:rPr>
+            <w:rStyle w:val="Hyperlink"/>
+          </w:rPr>
+          <w:t xml:space="preserve">brandwatch.com/guides/social-listening-for-government-best-practices</w:t>
+        </w:r>
+      </w:hyperlink>
+    </w:p>
+    <w:p>
+      <w:pPr>
+        <w:spacing w:after="80"/>
+      </w:pPr>
+      <w:r>
+        <w:t xml:space="preserve">· Brandwatch vs Meltwater vs Talkwalker (Syncly) — </w:t>
+      </w:r>
+      <w:hyperlink w:history="1" r:id="rIdzyvzirfuzbpz8onf0uc9z">
+        <w:r>
+          <w:rPr>
+            <w:rStyle w:val="Hyperlink"/>
+          </w:rPr>
+          <w:t xml:space="preserve">syncly.app</w:t>
+        </w:r>
+      </w:hyperlink>
+    </w:p>
+    <w:p>
+      <w:pPr>
+        <w:spacing w:after="80"/>
+      </w:pPr>
+      <w:r>
+        <w:t xml:space="preserve">· Brandwatch pricing on Vendr — </w:t>
+      </w:r>
+      <w:hyperlink w:history="1" r:id="rIdzrt2km1uklmkt17ddzzej">
+        <w:r>
+          <w:rPr>
+            <w:rStyle w:val="Hyperlink"/>
+          </w:rPr>
+          <w:t xml:space="preserve">vendr.com/marketplace/brandwatch</w:t>
+        </w:r>
+      </w:hyperlink>
+    </w:p>
+    <w:p>
+      <w:pPr>
+        <w:pStyle w:val="Heading2"/>
+        <w:spacing w:after="160" w:before="280"/>
+      </w:pPr>
+      <w:r>
+        <w:rPr>
+          <w:b/>
+          <w:bCs/>
+        </w:rPr>
         <w:t xml:space="preserve">Open source</w:t>
       </w:r>
     </w:p>
@@ -16066,7 +17708,7 @@
       <w:r>
         <w:t xml:space="preserve">· Listmonk — </w:t>
       </w:r>
-      <w:hyperlink w:history="1" r:id="rIdifzn5luofuyavl4jblcvl">
+      <w:hyperlink w:history="1" r:id="rIdmmlqjox7evhu2ee9txwj2">
         <w:r>
           <w:rPr>
             <w:rStyle w:val="Hyperlink"/>
@@ -16082,7 +17724,7 @@
       <w:r>
         <w:t xml:space="preserve">· Chatwoot — </w:t>
       </w:r>
-      <w:hyperlink w:history="1" r:id="rId7nnttcco4ztq-ae9bipdb">
+      <w:hyperlink w:history="1" r:id="rId2mprjfwk8hkibufrfotoi">
         <w:r>
           <w:rPr>
             <w:rStyle w:val="Hyperlink"/>
@@ -16098,7 +17740,7 @@
       <w:r>
         <w:t xml:space="preserve">· Baileys — </w:t>
       </w:r>
-      <w:hyperlink w:history="1" r:id="rIdmlc0vbcshfurj-w8wp6ec">
+      <w:hyperlink w:history="1" r:id="rIdy12ryf0hllb5qxn_vcxda">
         <w:r>
           <w:rPr>
             <w:rStyle w:val="Hyperlink"/>
@@ -16114,7 +17756,7 @@
       <w:r>
         <w:t xml:space="preserve">· Evolution API — </w:t>
       </w:r>
-      <w:hyperlink w:history="1" r:id="rIdwkyauhhsi26tehqgsfwfd">
+      <w:hyperlink w:history="1" r:id="rIdmvomrsnx8rcb6gwtumb2m">
         <w:r>
           <w:rPr>
             <w:rStyle w:val="Hyperlink"/>
@@ -16130,7 +17772,7 @@
       <w:r>
         <w:t xml:space="preserve">· Formbricks — </w:t>
       </w:r>
-      <w:hyperlink w:history="1" r:id="rIdgqsexsteyv0bsmve4j7dc">
+      <w:hyperlink w:history="1" r:id="rId_wt0--fli8nqpqpk6ppql">
         <w:r>
           <w:rPr>
             <w:rStyle w:val="Hyperlink"/>
@@ -16146,7 +17788,7 @@
       <w:r>
         <w:t xml:space="preserve">· SurveyJS — </w:t>
       </w:r>
-      <w:hyperlink w:history="1" r:id="rIdjwb-8b3ulnskzjsiydin1">
+      <w:hyperlink w:history="1" r:id="rIdnqwsobjgwn_iqi--mfbko">
         <w:r>
           <w:rPr>
             <w:rStyle w:val="Hyperlink"/>
@@ -16162,7 +17804,7 @@
       <w:r>
         <w:t xml:space="preserve">· Typebot vs Botpress — </w:t>
       </w:r>
-      <w:hyperlink w:history="1" r:id="rIdl9yrpqlive62m5hfgaloi">
+      <w:hyperlink w:history="1" r:id="rIdcceuhr0f7vkyrmmswdwts">
         <w:r>
           <w:rPr>
             <w:rStyle w:val="Hyperlink"/>
@@ -16178,7 +17820,7 @@
       <w:r>
         <w:t xml:space="preserve">· Awesome Political Tech list — </w:t>
       </w:r>
-      <w:hyperlink w:history="1" r:id="rIdsgg37w9y3ax58t-ssteb8">
+      <w:hyperlink w:history="1" r:id="rId4nrh-1seb3l1_bpy08pfc">
         <w:r>
           <w:rPr>
             <w:rStyle w:val="Hyperlink"/>
@@ -16207,7 +17849,7 @@
       <w:r>
         <w:t xml:space="preserve">· LLM-Assisted Thematic Analysis (arXiv 2026) — </w:t>
       </w:r>
-      <w:hyperlink w:history="1" r:id="rIdlup0qbd0lhjvjebq_bwrz">
+      <w:hyperlink w:history="1" r:id="rIdqtf5guter3ogasst32ffh">
         <w:r>
           <w:rPr>
             <w:rStyle w:val="Hyperlink"/>
@@ -16223,7 +17865,7 @@
       <w:r>
         <w:t xml:space="preserve">· Qualitative Coding via Open-Source LLMs (CHI 2026) — </w:t>
       </w:r>
-      <w:hyperlink w:history="1" r:id="rIdfab2yxyw-fpjhulbesige">
+      <w:hyperlink w:history="1" r:id="rId4uwxn6wrz0a26unpjbaun">
         <w:r>
           <w:rPr>
             <w:rStyle w:val="Hyperlink"/>
@@ -16239,7 +17881,7 @@
       <w:r>
         <w:t xml:space="preserve">· Few-shot classification of survey responses (arXiv 2025) — </w:t>
       </w:r>
-      <w:hyperlink w:history="1" r:id="rId11lelhaxmogofxepqrqle">
+      <w:hyperlink w:history="1" r:id="rIduyz3q-pljafpzr90ssimo">
         <w:r>
           <w:rPr>
             <w:rStyle w:val="Hyperlink"/>

</xml_diff>